<commit_message>
Add live demo and repo links to concept note and pitch deck
</commit_message>
<xml_diff>
--- a/project-docs/EcoFeast_Concept_Note.docx
+++ b/project-docs/EcoFeast_Concept_Note.docx
@@ -1320,8 +1320,20 @@
           <w:sz w:val="22"/>
           <w:szCs w:val="22"/>
         </w:rPr>
-        <w:t xml:space="preserve">GitHub Repository: [Add repository link once published]</w:t>
-      </w:r>
+        <w:t xml:space="preserve">GitHub Repository: </w:t>
+      </w:r>
+      <w:hyperlink r:id="rIdGithubLink">
+        <w:r>
+          <w:rPr>
+            <w:rFonts w:ascii="Calibri" w:hAnsi="Calibri"/>
+            <w:color w:val="0563C1"/>
+            <w:u w:val="single"/>
+            <w:sz w:val="22"/>
+            <w:szCs w:val="22"/>
+          </w:rPr>
+          <w:t>https://github.com/HarshaliAlave/food-distribution-swarm</w:t>
+        </w:r>
+      </w:hyperlink>
     </w:p>
     <w:p>
       <w:pPr>
@@ -1333,8 +1345,20 @@
           <w:sz w:val="22"/>
           <w:szCs w:val="22"/>
         </w:rPr>
-        <w:t xml:space="preserve">Live Demo: [Add demo link once deployed]</w:t>
-      </w:r>
+        <w:t xml:space="preserve">Live Demo: </w:t>
+      </w:r>
+      <w:hyperlink r:id="rIdLiveDemoLink">
+        <w:r>
+          <w:rPr>
+            <w:rFonts w:ascii="Calibri" w:hAnsi="Calibri"/>
+            <w:color w:val="0563C1"/>
+            <w:u w:val="single"/>
+            <w:sz w:val="22"/>
+            <w:szCs w:val="22"/>
+          </w:rPr>
+          <w:t>https://ecofeast.streamlit.app/</w:t>
+        </w:r>
+      </w:hyperlink>
     </w:p>
     <w:sectPr>
       <w:pgSz w:w="12240" w:h="15840" w:orient="portrait"/>

</xml_diff>